<commit_message>
Document frame-layered pair-energy mode
</commit_message>
<xml_diff>
--- a/pipelines/pair_energy/docs/ENERGY_MODEL_ARCHITECTURE.docx
+++ b/pipelines/pair_energy/docs/ENERGY_MODEL_ARCHITECTURE.docx
@@ -873,6 +873,16 @@
       <w:proofErr w:type="spellStart"/>
       <w:proofErr w:type="spellEnd"/>
     </w:p>
+    <w:p>
+      <w:r>
+        <w:t>The temporal core is selected by --temporal-architecture. The default stacked mode uses the standard PyTorch nn.RNN/GRU/LSTM interpretation of rnn_layers: every history frame passes through every recurrent layer. The experimental frame-layered mode (--temporal-architecture frame-layered) assigns each history frame to its own recurrent cell, h_i = cell_i(x_i, h_{i-1}), so rnn_layers must exactly match the dataset sequence_length. For the current three-frame force datasets this means rnn_layers=3.</w:t>
+      </w:r>
+    </w:p>
+    <w:p>
+      <w:r>
+        <w:t>The frame-layered mode is currently implemented for the pair-energy architecture and is exposed through pipelines/pair_energy/cluster/submit_search.py. It keeps the same pair-energy symmetry and force-from-energy construction; only the routing of the time history through the recurrent core changes.</w:t>
+      </w:r>
+    </w:p>
     <w:p/>
     <w:tbl>
       <w:tblPr>
@@ -1716,39 +1726,9 @@
       </w:pPr>
     </w:p>
     <w:p>
-      <w:proofErr w:type="spellStart"/>
       <w:r>
-        <w:t>Current recommended search setup for the pair-energy model: at least 30000 training frames, RNN final-hidden, hidden_size=128, rnn_layers=1, bidirectional, neighbor_shells=2, training_target=force, acceleration_normalization=global, power_mean_loss_weight=0.1, acceleration_over_rms_loss_weight=0.1, acceleration_under_rms_loss_weight=0.01.</w:t>
+        <w:t>Current recommended search setup for the pair-energy model: force-enabled data, RNN final-hidden, hidden_size=128, bidirectional, neighbor_shells=2, training_target=force, acceleration_normalization=global, power_mean_loss_weight=0.1, acceleration_over_rms_loss_weight=0.1, acceleration_under_rms_loss_weight=0.01. The baseline stacked mode can still use rnn_layers=1. The current frame-layered experiments use --temporal-architecture frame-layered with rnn_layers=3 on three-frame histories and 90000 training frames.</w:t>
       </w:r>
-      <w:proofErr w:type="spellEnd"/>
-      <w:proofErr w:type="spellStart"/>
-      <w:proofErr w:type="spellEnd"/>
-      <w:proofErr w:type="spellStart"/>
-      <w:proofErr w:type="spellEnd"/>
-      <w:proofErr w:type="spellStart"/>
-      <w:proofErr w:type="spellEnd"/>
-      <w:proofErr w:type="spellStart"/>
-      <w:proofErr w:type="spellEnd"/>
-      <w:proofErr w:type="spellStart"/>
-      <w:proofErr w:type="spellEnd"/>
-      <w:proofErr w:type="spellStart"/>
-      <w:proofErr w:type="spellEnd"/>
-      <w:proofErr w:type="spellStart"/>
-      <w:proofErr w:type="spellEnd"/>
-      <w:proofErr w:type="spellStart"/>
-      <w:proofErr w:type="spellEnd"/>
-      <w:proofErr w:type="spellStart"/>
-      <w:proofErr w:type="spellEnd"/>
-      <w:proofErr w:type="spellStart"/>
-      <w:proofErr w:type="spellEnd"/>
-      <w:proofErr w:type="spellStart"/>
-      <w:proofErr w:type="spellEnd"/>
-      <w:proofErr w:type="spellStart"/>
-      <w:proofErr w:type="spellEnd"/>
-      <w:proofErr w:type="spellStart"/>
-      <w:proofErr w:type="spellEnd"/>
-      <w:proofErr w:type="spellStart"/>
-      <w:proofErr w:type="spellEnd"/>
     </w:p>
     <w:p>
       <w:pPr>

</xml_diff>